<commit_message>
Synthese en Overzicht v1.1a: cijfers in lijn met tweede lezing (uitgesteld 4.109, vervallen 327/112, doorstroom regulier circuit, 306/259 cijfers)
Co-Authored-By: Claude Fable 5.1 <noreply@anthropic.com>
Claude-Session: https://claude.ai/code/session_015NSunMLHkxfSG4sNUpSCHf
</commit_message>
<xml_diff>
--- a/docs/Overzicht_voorzieningen_werkvoorraad_v1.1_2026-10-01.docx
+++ b/docs/Overzicht_voorzieningen_werkvoorraad_v1.1_2026-10-01.docx
@@ -29,7 +29,7 @@
           <w:sz w:val="22"/>
           <w:szCs w:val="22"/>
         </w:rPr>
-        <w:t xml:space="preserve">Stand 1 oktober 2026, versie 1.1 (na ronde 4) · bijlage bij het synthesedocument v1.1 · 20 voorzieningen in de inventaris + 6 kandidaten</w:t>
+        <w:t xml:space="preserve">Stand 1 oktober 2026, versie 1.1a (na ronde 4 en tweede lezing) · bijlage bij het synthesedocument v1.1 · 20 voorzieningen in de inventaris + 6 kandidaten</w:t>
       </w:r>
     </w:p>
     <w:p>
@@ -196,7 +196,7 @@
           <w:sz w:val="21"/>
           <w:szCs w:val="21"/>
         </w:rPr>
-        <w:t xml:space="preserve"> voor de 5: ongeveer 2 à 3 werkdagen inclusief tweede lezing, bij de huidige werkwijze (bronnen zoeken via het Parlement, seed-script, controle, publicatie); daarbovenop de tweede lezing van de 91 nieuwe cijfers uit ronde 4.</w:t>
+        <w:t xml:space="preserve"> voor de 5: ongeveer 2 à 3 werkdagen inclusief tweede lezing, bij de huidige werkwijze (bronnen zoeken via het Parlement, seed-script, controle, publicatie); de tweede lezing van ronde 4 is afgerond (306 cijfers, 259 gecontroleerd).</w:t>
       </w:r>
     </w:p>
     <w:p>
@@ -1895,7 +1895,7 @@
                 <w:sz w:val="18"/>
                 <w:szCs w:val="18"/>
               </w:rPr>
-              <w:t xml:space="preserve">wachtenden eind 2025/2026 enkel via nieuwe SV; WEWIS-export per kwartaal; tweede lezing</w:t>
+              <w:t xml:space="preserve">wachtenden eind 2025/2026 enkel via nieuwe SV; WEWIS-export per kwartaal; tweede lezing gedaan</w:t>
             </w:r>
           </w:p>
         </w:tc>
@@ -2033,7 +2033,7 @@
                 <w:sz w:val="18"/>
                 <w:szCs w:val="18"/>
               </w:rPr>
-              <w:t xml:space="preserve">2.110 wzc nog te realiseren, 4.259 uitgesteld, 509 vervallen (1-1-2026); 83.923 erkend</w:t>
+              <w:t xml:space="preserve">2.110 wzc nog te realiseren, 4.109 uitgesteld (excl. Brussel), 509 vervallen (1-1-2026); 83.923 erkend</w:t>
             </w:r>
           </w:p>
         </w:tc>
@@ -2099,7 +2099,7 @@
                 <w:sz w:val="18"/>
                 <w:szCs w:val="18"/>
               </w:rPr>
-              <w:t xml:space="preserve">nieuwe erkenningskalender (VR zomer 2026); discrepantie vervallen 112/327; tweede lezing</w:t>
+              <w:t xml:space="preserve">nieuwe erkenningskalender (VR zomer 2026); tweede lezing gedaan (1-10-2026)</w:t>
             </w:r>
           </w:p>
         </w:tc>
@@ -2303,7 +2303,7 @@
                 <w:sz w:val="18"/>
                 <w:szCs w:val="18"/>
               </w:rPr>
-              <w:t xml:space="preserve">LOP-rapport Antwerpen 2026; leerlingen 2023-24 tot 2025-26 (Dataloep); tweede lezing</w:t>
+              <w:t xml:space="preserve">LOP-rapport Antwerpen 2026; leerlingen 2023-24 tot 2025-26 (Dataloep); tweede lezing gedaan</w:t>
             </w:r>
           </w:p>
         </w:tc>

</xml_diff>